<commit_message>
Umowa i instrukcja w wersji 2: zdjęcie lub skan podpisu
Zdjęcie albo skan podpisanej umowy wystarcza do jej zawarcia (§ 10 ust. 1),
ale nie do przeniesienia praw autorskich (§ 7 ust. 3). To samo w instrukcji
i w e-mailach do klienta. Nowe linki do Dokumentów Google w README.

Co-Authored-By: Claude Opus 5.5 <noreply@anthropic.com>
Claude-Session: https://claude.ai/code/session_011o5jQAL4sM6bgK36e4Vgpi
</commit_message>
<xml_diff>
--- a/firma/umowy/build/umowa.docx
+++ b/firma/umowy/build/umowa.docx
@@ -44,7 +44,7 @@
               <w:t xml:space="preserve">WZÓR</w:t>
             </w:r>
             <w:r>
-              <w:t xml:space="preserve"> · wersja 1 z 20.10.2026 · przed wysłaniem usuń tę ramkę</w:t>
+              <w:t xml:space="preserve"> · wersja 2 z 20.10.2026 · przed wysłaniem usuń tę ramkę</w:t>
             </w:r>
           </w:p>
           <w:p>
@@ -738,7 +738,7 @@
         <w:spacing w:after="80"/>
       </w:pPr>
       <w:r>
-        <w:t xml:space="preserve">W ciągu 14 dni od zapłaty całego wynagrodzenia strony podpisują protokół odbioru i umowę przeniesienia autorskich praw majątkowych według wzoru z Załącznika 3. Przeniesienie praw wymaga formy pisemnej (art. 53 ustawy o prawie autorskim i prawach pokrewnych), dlatego strony podpisują ten dokument na papierze albo kwalifikowanymi podpisami elektronicznymi. Wykonawca przygotowuje go i pokrywa koszt wysyłki. Z chwilą jego podpisania prawa przechodzą na Zamawiającego, a licencja z ust. 2 wygasa.</w:t>
+        <w:t xml:space="preserve">W ciągu 14 dni od zapłaty całego wynagrodzenia strony podpisują protokół odbioru i umowę przeniesienia autorskich praw majątkowych według wzoru z Załącznika 3. Przeniesienie praw wymaga formy pisemnej (art. 53 ustawy o prawie autorskim i prawach pokrewnych), dlatego strony podpisują ten dokument na papierze albo kwalifikowanymi podpisami elektronicznymi; zdjęcie ani skan podpisanego dokumentu nie wystarczą. Wykonawca przygotowuje go i pokrywa koszt wysyłki. Z chwilą jego podpisania prawa przechodzą na Zamawiającego, a licencja z ust. 2 wygasa.</w:t>
       </w:r>
     </w:p>
     <w:p>
@@ -1038,7 +1038,7 @@
         <w:spacing w:after="80"/>
       </w:pPr>
       <w:r>
-        <w:t xml:space="preserve">Umowę zawiera się na odległość. Wykonawca wysyła ją Zamawiającemu e-mailem w pliku PDF. Zamawiający przyjmuje ją, odpisując z adresu e-mail podanego w umowie wiadomością o treści zaproponowanej przez Wykonawcę albo odsyłając umowę podpisaną podpisem elektronicznym lub własnoręcznie. Umowa jest zawarta w dniu, w którym Wykonawca otrzyma tę odpowiedź. Wykonawca potwierdza zawarcie umowy e-mailem z jej treścią w pliku PDF.</w:t>
+        <w:t xml:space="preserve">Umowę zawiera się na odległość. Wykonawca wysyła ją Zamawiającemu e-mailem w pliku PDF. Zamawiający przyjmuje ją, odpisując z adresu e-mail podanego w umowie wiadomością o treści zaproponowanej przez Wykonawcę albo odsyłając umowę podpisaną podpisem elektronicznym lub własnoręcznie; przy podpisie własnoręcznym wystarczy zdjęcie albo skan podpisanej umowy. Umowa jest zawarta w dniu, w którym Wykonawca otrzyma tę odpowiedź. Wykonawca potwierdza zawarcie umowy e-mailem z jej treścią w pliku PDF.</w:t>
       </w:r>
     </w:p>
     <w:p>

</xml_diff>

<commit_message>
Umowa w wersji 4: zakres wariantu i materiały wprost w umowie
Pod tabelą zamówienia: pełna lista tego, co obejmuje wariant 1, 2 albo 3
(w kopii dla klienta zostaje jedna), co jest poza ceną i co dostarcza
klient. E-mail „Umowa” odsyła do tych list zamiast do propozycji.

Co-Authored-By: Claude Opus 5.5 <noreply@anthropic.com>
Claude-Session: https://claude.ai/code/session_011o5jQAL4sM6bgK36e4Vgpi
</commit_message>
<xml_diff>
--- a/firma/umowy/build/umowa.docx
+++ b/firma/umowy/build/umowa.docx
@@ -44,7 +44,7 @@
               <w:t xml:space="preserve">WZÓR</w:t>
             </w:r>
             <w:r>
-              <w:t xml:space="preserve"> · wersja 3 z 20.10.2026 · przed wysłaniem usuń tę ramkę</w:t>
+              <w:t xml:space="preserve"> · wersja 4 z 20.10.2026 · przed wysłaniem usuń tę ramkę</w:t>
             </w:r>
           </w:p>
           <w:p>
@@ -67,7 +67,7 @@
               <w:t xml:space="preserve">Zielone</w:t>
             </w:r>
             <w:r>
-              <w:t xml:space="preserve">: zostaw właściwą opcję. Potem Ctrl+A → zakreślacz → Brak i Plik → Pobierz → PDF.</w:t>
+              <w:t xml:space="preserve">: zostaw właściwą opcję, a w „Co obejmuje zamówienie” tylko listę wybranego wariantu. Potem Ctrl+A → zakreślacz → Brak i Plik → Pobierz → PDF.</w:t>
             </w:r>
           </w:p>
         </w:tc>
@@ -244,7 +244,7 @@
               <w:rPr>
                 <w:b/>
               </w:rPr>
-              <w:t xml:space="preserve">Zakres</w:t>
+              <w:t xml:space="preserve">Wariant</w:t>
             </w:r>
           </w:p>
         </w:tc>
@@ -257,37 +257,25 @@
               <w:spacing w:after="0"/>
             </w:pPr>
             <w:r>
-              <w:t xml:space="preserve">wariant </w:t>
-            </w:r>
-            <w:r>
               <w:rPr>
                 <w:shd w:val="clear" w:color="auto" w:fill="B6D7A8"/>
               </w:rPr>
               <w:t xml:space="preserve">1 Wizytówka / 2 Wizytówka, która umawia / 3 Pełny start</w:t>
             </w:r>
             <w:r>
-              <w:t xml:space="preserve"> z propozycji z dnia </w:t>
+              <w:rPr>
+                <w:shd w:val="clear" w:color="auto" w:fill="B6D7A8"/>
+              </w:rPr>
+              <w:t xml:space="preserve">; dodatki: </w:t>
             </w:r>
             <w:r>
               <w:rPr>
                 <w:shd w:val="clear" w:color="auto" w:fill="FFE599"/>
               </w:rPr>
-              <w:t xml:space="preserve">{{DATA_PROPOZYCJI}}</w:t>
-            </w:r>
-            <w:r>
-              <w:t xml:space="preserve">, która jest częścią umowy</w:t>
-            </w:r>
-            <w:r>
-              <w:rPr>
-                <w:shd w:val="clear" w:color="auto" w:fill="B6D7A8"/>
-              </w:rPr>
-              <w:t xml:space="preserve">; dodatki: </w:t>
-            </w:r>
-            <w:r>
-              <w:rPr>
-                <w:shd w:val="clear" w:color="auto" w:fill="FFE599"/>
-              </w:rPr>
               <w:t xml:space="preserve">{{DODATKI}}</w:t>
+            </w:r>
+            <w:r>
+              <w:t xml:space="preserve"> (szczegóły niżej)</w:t>
             </w:r>
           </w:p>
         </w:tc>
@@ -507,6 +495,23 @@
     </w:p>
     <w:p>
       <w:pPr>
+        <w:pStyle w:val="Nagwek2"/>
+      </w:pPr>
+      <w:r>
+        <w:t xml:space="preserve">Co obejmuje zamówienie</w:t>
+      </w:r>
+    </w:p>
+    <w:p>
+      <w:pPr/>
+      <w:r>
+        <w:rPr>
+          <w:shd w:val="clear" w:color="auto" w:fill="B6D7A8"/>
+        </w:rPr>
+        <w:t xml:space="preserve">[zostaw przy wariancie 1 Wizytówka]</w:t>
+      </w:r>
+    </w:p>
+    <w:p>
+      <w:pPr>
         <w:numPr>
           <w:ilvl w:val="0"/>
           <w:numId w:val="1"/>
@@ -514,20 +519,423 @@
         <w:spacing w:after="80"/>
       </w:pPr>
       <w:r>
+        <w:t xml:space="preserve">strona jednostronicowa do 6 sekcji, dopasowana do komputera i telefonu;</w:t>
+      </w:r>
+    </w:p>
+    <w:p>
+      <w:pPr>
+        <w:numPr>
+          <w:ilvl w:val="0"/>
+          <w:numId w:val="1"/>
+        </w:numPr>
+        <w:spacing w:after="80"/>
+      </w:pPr>
+      <w:r>
+        <w:t xml:space="preserve">teksty napisane na podstawie ankiety;</w:t>
+      </w:r>
+    </w:p>
+    <w:p>
+      <w:pPr>
+        <w:numPr>
+          <w:ilvl w:val="0"/>
+          <w:numId w:val="1"/>
+        </w:numPr>
+        <w:spacing w:after="80"/>
+      </w:pPr>
+      <w:r>
+        <w:t xml:space="preserve">formularz kontaktowy: każde zapytanie trafia na e-mail Zamawiającego i do arkusza Google na jego koncie, a klient dostaje potwierdzenie;</w:t>
+      </w:r>
+    </w:p>
+    <w:p>
+      <w:pPr>
+        <w:numPr>
+          <w:ilvl w:val="0"/>
+          <w:numId w:val="1"/>
+        </w:numPr>
+        <w:spacing w:after="80"/>
+      </w:pPr>
+      <w:r>
+        <w:t xml:space="preserve">podstawy SEO: tytuły i opisy, mapa strony, zgłoszenie Strony do Google;</w:t>
+      </w:r>
+    </w:p>
+    <w:p>
+      <w:pPr>
+        <w:numPr>
+          <w:ilvl w:val="0"/>
+          <w:numId w:val="1"/>
+        </w:numPr>
+        <w:spacing w:after="80"/>
+      </w:pPr>
+      <w:r>
+        <w:t xml:space="preserve">polityka prywatności i informacje formalne (wzór do sprawdzenia przez Zamawiającego, pkt 4);</w:t>
+      </w:r>
+    </w:p>
+    <w:p>
+      <w:pPr>
+        <w:numPr>
+          <w:ilvl w:val="0"/>
+          <w:numId w:val="1"/>
+        </w:numPr>
+        <w:spacing w:after="80"/>
+      </w:pPr>
+      <w:r>
+        <w:t xml:space="preserve">podłączenie domeny, publikacja, instrukcja z nagraniem, 30 dni wsparcia i raport po 30 dniach.</w:t>
+      </w:r>
+    </w:p>
+    <w:p>
+      <w:pPr/>
+      <w:r>
+        <w:rPr>
+          <w:shd w:val="clear" w:color="auto" w:fill="B6D7A8"/>
+        </w:rPr>
+        <w:t xml:space="preserve">[zostaw przy wariancie 2 Wizytówka, która umawia]</w:t>
+      </w:r>
+    </w:p>
+    <w:p>
+      <w:pPr>
+        <w:numPr>
+          <w:ilvl w:val="0"/>
+          <w:numId w:val="2"/>
+        </w:numPr>
+        <w:spacing w:after="80"/>
+      </w:pPr>
+      <w:r>
+        <w:t xml:space="preserve">strona jednostronicowa do 6 sekcji, dopasowana do komputera i telefonu;</w:t>
+      </w:r>
+    </w:p>
+    <w:p>
+      <w:pPr>
+        <w:numPr>
+          <w:ilvl w:val="0"/>
+          <w:numId w:val="2"/>
+        </w:numPr>
+        <w:spacing w:after="80"/>
+      </w:pPr>
+      <w:r>
+        <w:t xml:space="preserve">teksty napisane na podstawie ankiety, z odpowiedziami na najczęstsze pytania klientów i miejscem na opinie;</w:t>
+      </w:r>
+    </w:p>
+    <w:p>
+      <w:pPr>
+        <w:numPr>
+          <w:ilvl w:val="0"/>
+          <w:numId w:val="2"/>
+        </w:numPr>
+        <w:spacing w:after="80"/>
+      </w:pPr>
+      <w:r>
+        <w:t xml:space="preserve">formularz wstępnych pytań i kalendarz konsultacji: klient sam wybiera termin i dostaje potwierdzenie, a każde zgłoszenie trafia na e-mail Zamawiającego i do arkusza Google na jego koncie;</w:t>
+      </w:r>
+    </w:p>
+    <w:p>
+      <w:pPr>
+        <w:numPr>
+          <w:ilvl w:val="0"/>
+          <w:numId w:val="2"/>
+        </w:numPr>
+        <w:spacing w:after="80"/>
+      </w:pPr>
+      <w:r>
+        <w:t xml:space="preserve">Profil Firmy w Google z linkiem do umawiania, jeśli firma spełnia wytyczne Google;</w:t>
+      </w:r>
+    </w:p>
+    <w:p>
+      <w:pPr>
+        <w:numPr>
+          <w:ilvl w:val="0"/>
+          <w:numId w:val="2"/>
+        </w:numPr>
+        <w:spacing w:after="80"/>
+      </w:pPr>
+      <w:r>
+        <w:t xml:space="preserve">podstawy SEO: tytuły i opisy, mapa strony, zgłoszenie Strony do Google;</w:t>
+      </w:r>
+    </w:p>
+    <w:p>
+      <w:pPr>
+        <w:numPr>
+          <w:ilvl w:val="0"/>
+          <w:numId w:val="2"/>
+        </w:numPr>
+        <w:spacing w:after="80"/>
+      </w:pPr>
+      <w:r>
+        <w:t xml:space="preserve">polityka prywatności i informacje formalne (wzór do sprawdzenia przez Zamawiającego, pkt 4);</w:t>
+      </w:r>
+    </w:p>
+    <w:p>
+      <w:pPr>
+        <w:numPr>
+          <w:ilvl w:val="0"/>
+          <w:numId w:val="2"/>
+        </w:numPr>
+        <w:spacing w:after="80"/>
+      </w:pPr>
+      <w:r>
+        <w:t xml:space="preserve">podłączenie domeny, publikacja, instrukcja z nagraniem, 30 dni wsparcia i raport po 30 dniach.</w:t>
+      </w:r>
+    </w:p>
+    <w:p>
+      <w:pPr/>
+      <w:r>
+        <w:rPr>
+          <w:shd w:val="clear" w:color="auto" w:fill="B6D7A8"/>
+        </w:rPr>
+        <w:t xml:space="preserve">[zostaw przy wariancie 3 Pełny start]</w:t>
+      </w:r>
+    </w:p>
+    <w:p>
+      <w:pPr>
+        <w:numPr>
+          <w:ilvl w:val="0"/>
+          <w:numId w:val="3"/>
+        </w:numPr>
+        <w:spacing w:after="80"/>
+      </w:pPr>
+      <w:r>
+        <w:t xml:space="preserve">strona jednostronicowa do 6 sekcji, dopasowana do komputera i telefonu;</w:t>
+      </w:r>
+    </w:p>
+    <w:p>
+      <w:pPr>
+        <w:numPr>
+          <w:ilvl w:val="0"/>
+          <w:numId w:val="3"/>
+        </w:numPr>
+        <w:spacing w:after="80"/>
+      </w:pPr>
+      <w:r>
+        <w:t xml:space="preserve">teksty napisane na podstawie ankiety, z odpowiedziami na najczęstsze pytania klientów i miejscem na opinie;</w:t>
+      </w:r>
+    </w:p>
+    <w:p>
+      <w:pPr>
+        <w:numPr>
+          <w:ilvl w:val="0"/>
+          <w:numId w:val="3"/>
+        </w:numPr>
+        <w:spacing w:after="80"/>
+      </w:pPr>
+      <w:r>
+        <w:t xml:space="preserve">formularz wstępnych pytań i kalendarz konsultacji: klient sam wybiera termin i dostaje potwierdzenie, a każde zgłoszenie trafia na e-mail Zamawiającego i do arkusza Google na jego koncie;</w:t>
+      </w:r>
+    </w:p>
+    <w:p>
+      <w:pPr>
+        <w:numPr>
+          <w:ilvl w:val="0"/>
+          <w:numId w:val="3"/>
+        </w:numPr>
+        <w:spacing w:after="80"/>
+      </w:pPr>
+      <w:r>
+        <w:t xml:space="preserve">Profil Firmy w Google z linkiem do umawiania, jeśli firma spełnia wytyczne Google;</w:t>
+      </w:r>
+    </w:p>
+    <w:p>
+      <w:pPr>
+        <w:numPr>
+          <w:ilvl w:val="0"/>
+          <w:numId w:val="3"/>
+        </w:numPr>
+        <w:spacing w:after="80"/>
+      </w:pPr>
+      <w:r>
+        <w:t xml:space="preserve">film powitalny do 60 sekund: scenariusz, nagranie i montaż;</w:t>
+      </w:r>
+    </w:p>
+    <w:p>
+      <w:pPr>
+        <w:numPr>
+          <w:ilvl w:val="0"/>
+          <w:numId w:val="3"/>
+        </w:numPr>
+        <w:spacing w:after="80"/>
+      </w:pPr>
+      <w:r>
+        <w:t xml:space="preserve">poradnik PDF dla klientów Zamawiającego, z treścią merytoryczną od Zamawiającego;</w:t>
+      </w:r>
+    </w:p>
+    <w:p>
+      <w:pPr>
+        <w:numPr>
+          <w:ilvl w:val="0"/>
+          <w:numId w:val="3"/>
+        </w:numPr>
+        <w:spacing w:after="80"/>
+      </w:pPr>
+      <w:r>
+        <w:t xml:space="preserve">system próśb o opinie: karta z kodem QR, wiadomość SMS i e-mail;</w:t>
+      </w:r>
+    </w:p>
+    <w:p>
+      <w:pPr>
+        <w:numPr>
+          <w:ilvl w:val="0"/>
+          <w:numId w:val="3"/>
+        </w:numPr>
+        <w:spacing w:after="80"/>
+      </w:pPr>
+      <w:r>
+        <w:t xml:space="preserve">podstawy SEO: tytuły i opisy, mapa strony, zgłoszenie Strony do Google;</w:t>
+      </w:r>
+    </w:p>
+    <w:p>
+      <w:pPr>
+        <w:numPr>
+          <w:ilvl w:val="0"/>
+          <w:numId w:val="3"/>
+        </w:numPr>
+        <w:spacing w:after="80"/>
+      </w:pPr>
+      <w:r>
+        <w:t xml:space="preserve">polityka prywatności i informacje formalne (wzór do sprawdzenia przez Zamawiającego, pkt 4);</w:t>
+      </w:r>
+    </w:p>
+    <w:p>
+      <w:pPr>
+        <w:numPr>
+          <w:ilvl w:val="0"/>
+          <w:numId w:val="3"/>
+        </w:numPr>
+        <w:spacing w:after="80"/>
+      </w:pPr>
+      <w:r>
+        <w:t xml:space="preserve">podłączenie domeny, publikacja, instrukcja z nagraniem, 30 dni wsparcia i raport po 30 dniach.</w:t>
+      </w:r>
+    </w:p>
+    <w:p>
+      <w:pPr/>
+      <w:r>
+        <w:rPr>
+          <w:b/>
+        </w:rPr>
+        <w:t xml:space="preserve">Poza ceną:</w:t>
+      </w:r>
+      <w:r>
+        <w:t xml:space="preserve"> opłaty za domenę i hosting płacone dostawcy (ok. 55–75 zł netto za pierwszy rok, potem ok. 320–370 zł netto rocznie), płatne wtyczki i zdjęcia (tylko za zgodą Zamawiającego) oraz prace spoza tej listy, wyceniane osobno (pkt 5).</w:t>
+      </w:r>
+    </w:p>
+    <w:p>
+      <w:pPr>
+        <w:pStyle w:val="Nagwek2"/>
+      </w:pPr>
+      <w:r>
+        <w:t xml:space="preserve">Co dostarcza Zamawiający (do </w:t>
+      </w:r>
+      <w:r>
+        <w:rPr>
+          <w:shd w:val="clear" w:color="auto" w:fill="FFE599"/>
+        </w:rPr>
+        <w:t xml:space="preserve">{{MATERIALY_DO}}</w:t>
+      </w:r>
+      <w:r>
+        <w:t xml:space="preserve">)</w:t>
+      </w:r>
+    </w:p>
+    <w:p>
+      <w:pPr>
+        <w:numPr>
+          <w:ilvl w:val="0"/>
+          <w:numId w:val="4"/>
+        </w:numPr>
+        <w:spacing w:after="80"/>
+      </w:pPr>
+      <w:r>
+        <w:t xml:space="preserve">zdjęcie portretowe, a jeśli ma, także logo i inne zdjęcia;</w:t>
+      </w:r>
+    </w:p>
+    <w:p>
+      <w:pPr>
+        <w:numPr>
+          <w:ilvl w:val="0"/>
+          <w:numId w:val="4"/>
+        </w:numPr>
+        <w:spacing w:after="80"/>
+      </w:pPr>
+      <w:r>
+        <w:t xml:space="preserve">dane formalne: pełną nazwę, adres, NIP i informacje, których wymaga jego zawód (np. numer wpisu do rejestru);</w:t>
+      </w:r>
+    </w:p>
+    <w:p>
+      <w:pPr>
+        <w:numPr>
+          <w:ilvl w:val="0"/>
+          <w:numId w:val="4"/>
+        </w:numPr>
+        <w:spacing w:after="80"/>
+      </w:pPr>
+      <w:r>
+        <w:t xml:space="preserve">dostęp do domeny i hostingu przez osobne konto dla Wykonawcy albo ich zakup na swoją firmę według instrukcji Wykonawcy;</w:t>
+      </w:r>
+    </w:p>
+    <w:p>
+      <w:pPr>
+        <w:numPr>
+          <w:ilvl w:val="0"/>
+          <w:numId w:val="4"/>
+        </w:numPr>
+        <w:spacing w:after="80"/>
+      </w:pPr>
+      <w:r>
+        <w:t xml:space="preserve">przy wariantach 2 i 3: dostęp do konta Google firmy (kalendarz i Profil Firmy);</w:t>
+      </w:r>
+    </w:p>
+    <w:p>
+      <w:pPr>
+        <w:numPr>
+          <w:ilvl w:val="0"/>
+          <w:numId w:val="4"/>
+        </w:numPr>
+        <w:spacing w:after="80"/>
+      </w:pPr>
+      <w:r>
+        <w:t xml:space="preserve">przy wariancie 3: treść merytoryczną poradnika i ok. 30 minut na nagranie filmu według scenariusza Wykonawcy;</w:t>
+      </w:r>
+    </w:p>
+    <w:p>
+      <w:pPr>
+        <w:numPr>
+          <w:ilvl w:val="0"/>
+          <w:numId w:val="4"/>
+        </w:numPr>
+        <w:spacing w:after="80"/>
+      </w:pPr>
+      <w:r>
+        <w:t xml:space="preserve">ok. 20 minut na uwagi do szkicu.</w:t>
+      </w:r>
+    </w:p>
+    <w:p>
+      <w:pPr>
+        <w:pStyle w:val="Nagwek2"/>
+      </w:pPr>
+      <w:r>
+        <w:t xml:space="preserve">Zasady współpracy</w:t>
+      </w:r>
+    </w:p>
+    <w:p>
+      <w:pPr>
+        <w:numPr>
+          <w:ilvl w:val="0"/>
+          <w:numId w:val="5"/>
+        </w:numPr>
+        <w:spacing w:after="80"/>
+      </w:pPr>
+      <w:r>
         <w:rPr>
           <w:b/>
         </w:rPr>
         <w:t xml:space="preserve">Przedmiot.</w:t>
       </w:r>
       <w:r>
-        <w:t xml:space="preserve"> Wykonawca wykona dla Zamawiającego stronę internetową opisaną w tabeli i w propozycji (dalej: Strona), a Zamawiający ją odbierze i zapłaci cenę.</w:t>
-      </w:r>
-    </w:p>
-    <w:p>
-      <w:pPr>
-        <w:numPr>
-          <w:ilvl w:val="0"/>
-          <w:numId w:val="1"/>
+        <w:t xml:space="preserve"> Wykonawca wykona dla Zamawiającego stronę internetową opisaną wyżej (dalej: Strona), a Zamawiający ją odbierze i zapłaci cenę.</w:t>
+      </w:r>
+    </w:p>
+    <w:p>
+      <w:pPr>
+        <w:numPr>
+          <w:ilvl w:val="0"/>
+          <w:numId w:val="5"/>
         </w:numPr>
         <w:spacing w:after="80"/>
       </w:pPr>
@@ -545,7 +953,7 @@
       <w:pPr>
         <w:numPr>
           <w:ilvl w:val="0"/>
-          <w:numId w:val="1"/>
+          <w:numId w:val="5"/>
         </w:numPr>
         <w:spacing w:after="80"/>
       </w:pPr>
@@ -556,14 +964,14 @@
         <w:t xml:space="preserve">Konta i materiały.</w:t>
       </w:r>
       <w:r>
-        <w:t xml:space="preserve"> Domena, hosting, poczta i Profil Firmy w Google są na Zamawiającego, który płaci za nie bezpośrednio dostawcom. Wykonawca pracuje na osobnym koncie i nie prosi o hasła. Zamawiający przekazuje materiały wymienione w propozycji i ma do nich prawa.</w:t>
-      </w:r>
-    </w:p>
-    <w:p>
-      <w:pPr>
-        <w:numPr>
-          <w:ilvl w:val="0"/>
-          <w:numId w:val="1"/>
+        <w:t xml:space="preserve"> Domena, hosting, poczta i Profil Firmy w Google są na Zamawiającego, który płaci za nie bezpośrednio dostawcom. Wykonawca pracuje na osobnym koncie i nie prosi o hasła. Zamawiający przekazuje materiały wymienione wyżej i ma do nich prawa.</w:t>
+      </w:r>
+    </w:p>
+    <w:p>
+      <w:pPr>
+        <w:numPr>
+          <w:ilvl w:val="0"/>
+          <w:numId w:val="5"/>
         </w:numPr>
         <w:spacing w:after="80"/>
       </w:pPr>
@@ -581,7 +989,7 @@
       <w:pPr>
         <w:numPr>
           <w:ilvl w:val="0"/>
-          <w:numId w:val="1"/>
+          <w:numId w:val="5"/>
         </w:numPr>
         <w:spacing w:after="80"/>
       </w:pPr>
@@ -599,7 +1007,7 @@
       <w:pPr>
         <w:numPr>
           <w:ilvl w:val="0"/>
-          <w:numId w:val="1"/>
+          <w:numId w:val="5"/>
         </w:numPr>
         <w:spacing w:after="80"/>
       </w:pPr>
@@ -617,7 +1025,7 @@
       <w:pPr>
         <w:numPr>
           <w:ilvl w:val="0"/>
-          <w:numId w:val="1"/>
+          <w:numId w:val="5"/>
         </w:numPr>
         <w:spacing w:after="80"/>
       </w:pPr>
@@ -635,7 +1043,7 @@
       <w:pPr>
         <w:numPr>
           <w:ilvl w:val="0"/>
-          <w:numId w:val="1"/>
+          <w:numId w:val="5"/>
         </w:numPr>
         <w:spacing w:after="80"/>
       </w:pPr>
@@ -653,7 +1061,7 @@
       <w:pPr>
         <w:numPr>
           <w:ilvl w:val="0"/>
-          <w:numId w:val="1"/>
+          <w:numId w:val="5"/>
         </w:numPr>
         <w:spacing w:after="80"/>
       </w:pPr>
@@ -671,7 +1079,7 @@
       <w:pPr>
         <w:numPr>
           <w:ilvl w:val="0"/>
-          <w:numId w:val="1"/>
+          <w:numId w:val="5"/>
         </w:numPr>
         <w:spacing w:after="80"/>
       </w:pPr>
@@ -689,7 +1097,7 @@
       <w:pPr>
         <w:numPr>
           <w:ilvl w:val="0"/>
-          <w:numId w:val="1"/>
+          <w:numId w:val="5"/>
         </w:numPr>
         <w:spacing w:after="80"/>
       </w:pPr>
@@ -707,7 +1115,7 @@
       <w:pPr>
         <w:numPr>
           <w:ilvl w:val="0"/>
-          <w:numId w:val="1"/>
+          <w:numId w:val="5"/>
         </w:numPr>
         <w:spacing w:after="80"/>
       </w:pPr>
@@ -725,7 +1133,7 @@
       <w:pPr>
         <w:numPr>
           <w:ilvl w:val="0"/>
-          <w:numId w:val="1"/>
+          <w:numId w:val="5"/>
         </w:numPr>
         <w:spacing w:after="80"/>
       </w:pPr>
@@ -743,7 +1151,7 @@
       <w:pPr>
         <w:numPr>
           <w:ilvl w:val="0"/>
-          <w:numId w:val="1"/>
+          <w:numId w:val="5"/>
         </w:numPr>
         <w:spacing w:after="80"/>
       </w:pPr>
@@ -761,7 +1169,7 @@
       <w:pPr>
         <w:numPr>
           <w:ilvl w:val="0"/>
-          <w:numId w:val="1"/>
+          <w:numId w:val="5"/>
         </w:numPr>
         <w:spacing w:after="80"/>
       </w:pPr>
@@ -1079,6 +1487,18 @@
     </w:lvl>
   </w:abstractNum>
   <w:num w:numId="1">
+    <w:abstractNumId w:val="1"/>
+  </w:num>
+  <w:num w:numId="2">
+    <w:abstractNumId w:val="1"/>
+  </w:num>
+  <w:num w:numId="3">
+    <w:abstractNumId w:val="1"/>
+  </w:num>
+  <w:num w:numId="4">
+    <w:abstractNumId w:val="1"/>
+  </w:num>
+  <w:num w:numId="5">
     <w:abstractNumId w:val="0"/>
     <w:lvlOverride w:ilvl="0">
       <w:startOverride w:val="1"/>

</xml_diff>